<commit_message>
Publish the Google form after creating it
New Google Forms have a Publish button and unpublished forms cannot be
opened by respondents. Call setPublished(true) when the runtime has it.
The guide now mentions opening Apps Script from a form's menu and
checking the Publish button.

Co-Authored-By: Claude Opus 5.5 <noreply@anthropic.com>
Claude-Session: https://claude.ai/code/session_011YvVpnNpPKoWNFXd1cS6v3
</commit_message>
<xml_diff>
--- a/mau_forms_thi_clb/HUONG_DAN_GOOGLE_FORMS.docx
+++ b/mau_forms_thi_clb/HUONG_DAN_GOOGLE_FORMS.docx
@@ -380,7 +380,7 @@
         <w:t xml:space="preserve">1. </w:t>
       </w:r>
       <w:r>
-        <w:t>Mở trình duyệt, vào script.google.com, đăng nhập tài khoản Google.</w:t>
+        <w:t>Mở trình duyệt, vào script.google.com, đăng nhập tài khoản Google, bấm “Dự án mới” (New project). Cách khác: mở một biểu mẫu trống bất kỳ, bấm dấu ba chấm ở góc trên bên phải, chọn “Apps Script”. Hai cách như nhau.</w:t>
       </w:r>
     </w:p>
     <w:p>
@@ -394,7 +394,7 @@
         <w:t xml:space="preserve">2. </w:t>
       </w:r>
       <w:r>
-        <w:t>Bấm “Dự án mới” (New project) ở góc trên bên trái.</w:t>
+        <w:t>Xoá hết chữ có sẵn trong khung soạn thảo (dòng function myFunction...).</w:t>
       </w:r>
     </w:p>
     <w:p>
@@ -408,7 +408,7 @@
         <w:t xml:space="preserve">3. </w:t>
       </w:r>
       <w:r>
-        <w:t>Xoá hết chữ có sẵn trong khung soạn thảo (dòng function myFunction...).</w:t>
+        <w:t>Mở tệp TAO_GOOGLE_FORM.gs, chọn tất cả (Ctrl + A), sao chép (Ctrl + C), rồi dán vào khung soạn thảo (Ctrl + V).</w:t>
       </w:r>
     </w:p>
     <w:p>
@@ -422,7 +422,7 @@
         <w:t xml:space="preserve">4. </w:t>
       </w:r>
       <w:r>
-        <w:t>Mở tệp TAO_GOOGLE_FORM.gs, chọn tất cả (Ctrl + A), sao chép (Ctrl + C), rồi dán vào khung soạn thảo (Ctrl + V).</w:t>
+        <w:t>Bấm biểu tượng đĩa mềm để lưu. Đặt tên dự án, ví dụ “Đăng ký CLB”.</w:t>
       </w:r>
     </w:p>
     <w:p>
@@ -436,7 +436,7 @@
         <w:t xml:space="preserve">5. </w:t>
       </w:r>
       <w:r>
-        <w:t>Bấm biểu tượng đĩa mềm để lưu. Đặt tên dự án, ví dụ “Đăng ký CLB”.</w:t>
+        <w:t>Ở thanh trên cùng, chỗ chọn hàm, chọn taoBieuMau. Bấm “Chạy” (Run).</w:t>
       </w:r>
     </w:p>
     <w:p>
@@ -450,7 +450,7 @@
         <w:t xml:space="preserve">6. </w:t>
       </w:r>
       <w:r>
-        <w:t>Ở thanh trên cùng, chỗ chọn hàm, chọn taoBieuMau. Bấm “Chạy” (Run).</w:t>
+        <w:t>Google hỏi quyền truy cập. Bấm “Xem lại quyền” (Review permissions), chọn tài khoản.</w:t>
       </w:r>
     </w:p>
     <w:p>
@@ -464,7 +464,7 @@
         <w:t xml:space="preserve">7. </w:t>
       </w:r>
       <w:r>
-        <w:t>Google hỏi quyền truy cập. Bấm “Xem lại quyền” (Review permissions), chọn tài khoản.</w:t>
+        <w:t>Nếu hiện “Google chưa xác minh ứng dụng này”: bấm “Nâng cao” (Advanced), rồi “Đi tới Đăng ký CLB (không an toàn)”. Cảnh báo này hiện vì đoạn mã do chính em tạo, chưa qua Google duyệt. Mã chỉ làm việc trong Drive của em.</w:t>
       </w:r>
     </w:p>
     <w:p>
@@ -478,7 +478,7 @@
         <w:t xml:space="preserve">8. </w:t>
       </w:r>
       <w:r>
-        <w:t>Nếu hiện “Google chưa xác minh ứng dụng này”: bấm “Nâng cao” (Advanced), rồi “Đi tới Đăng ký CLB (không an toàn)”. Cảnh báo này hiện vì đoạn mã do chính em tạo, chưa qua Google duyệt. Mã chỉ làm việc trong Drive của em.</w:t>
+        <w:t>Bấm “Cho phép” (Allow). Đợi khoảng 1 tới 3 phút.</w:t>
       </w:r>
     </w:p>
     <w:p>
@@ -490,20 +490,6 @@
           <w:b/>
         </w:rPr>
         <w:t xml:space="preserve">9. </w:t>
-      </w:r>
-      <w:r>
-        <w:t>Bấm “Cho phép” (Allow). Đợi khoảng 1 tới 3 phút.</w:t>
-      </w:r>
-    </w:p>
-    <w:p>
-      <w:pPr>
-        <w:pStyle w:val="ListParagraph"/>
-      </w:pPr>
-      <w:r>
-        <w:rPr>
-          <w:b/>
-        </w:rPr>
-        <w:t xml:space="preserve">10. </w:t>
       </w:r>
       <w:r>
         <w:t>Khi chạy xong, phần “Nhật ký thực thi” (Execution log) ở dưới hiện hai đường dẫn: đường dẫn SỬA biểu mẫu và đường dẫn gửi HỌC SINH. Chép cả hai lại.</w:t>
@@ -588,6 +574,26 @@
           <w:b/>
         </w:rPr>
         <w:t xml:space="preserve">3. </w:t>
+      </w:r>
+      <w:r>
+        <w:rPr>
+          <w:b/>
+        </w:rPr>
+        <w:t>Xuất bản.</w:t>
+      </w:r>
+      <w:r>
+        <w:t xml:space="preserve"> Nếu nút “Xuất bản” ở góc trên còn màu tím, bấm vào để xuất bản. Chưa xuất bản thì học sinh không mở được biểu mẫu.</w:t>
+      </w:r>
+    </w:p>
+    <w:p>
+      <w:pPr>
+        <w:pStyle w:val="ListParagraph"/>
+      </w:pPr>
+      <w:r>
+        <w:rPr>
+          <w:b/>
+        </w:rPr>
+        <w:t xml:space="preserve">4. </w:t>
       </w:r>
       <w:r>
         <w:rPr>

</xml_diff>

<commit_message>
Cap exams at 5 clubs per day on the Google form
Google Forms cannot count Yes answers spread across pages, so add a
checkbox per day, right after the ranking grid, validated with
requireSelectAtMost(5). Grading only counts exams for ticked clubs:
an exam for an unticked club is dropped with a warning, and a ticked
club with no exam is flagged. The kiosk's over-5 case can no longer
reach the import files. Guide updated to match.

Co-Authored-By: Claude Opus 5.5 <noreply@anthropic.com>
Claude-Session: https://claude.ai/code/session_011YvVpnNpPKoWNFXd1cS6v3
</commit_message>
<xml_diff>
--- a/mau_forms_thi_clb/HUONG_DAN_GOOGLE_FORMS.docx
+++ b/mau_forms_thi_clb/HUONG_DAN_GOOGLE_FORMS.docx
@@ -626,7 +626,7 @@
         <w:pStyle w:val="ListBullet"/>
       </w:pPr>
       <w:r>
-        <w:t>Nhắc học sinh: mỗi buổi thi tối đa 5 CLB; buổi nào bận thì chọn “Không, em bận buổi này”; xếp hạng thì mỗi hạng chỉ chọn cho một CLB.</w:t>
+        <w:t>Nhắc học sinh: buổi nào bận thì chọn “Không, em bận buổi này”; xếp hạng thì mỗi hạng chỉ chọn cho một CLB; tick trước các CLB muốn thi, tối đa 5 CLB mỗi buổi. Chỉ bài thi của CLB đã tick mới được tính điểm.</w:t>
       </w:r>
     </w:p>
     <w:p>
@@ -997,7 +997,7 @@
         <w:t xml:space="preserve">4. </w:t>
       </w:r>
       <w:r>
-        <w:t>Đối chiếu với trang “Cảnh báo” trong BANG_DIEM.xlsx. Ví dụ: học sinh thi quá 5 CLB trong một buổi thì phần mềm sẽ bỏ cả buổi đó của em.</w:t>
+        <w:t>Đối chiếu với trang “Cảnh báo” trong BANG_DIEM.xlsx. Hai cảnh báo hay gặp: em làm bài một CLB mà không tick CLB đó (bài không được tính), và em tick một CLB mà không làm bài.</w:t>
       </w:r>
     </w:p>
     <w:p>

</xml_diff>

<commit_message>
Export raw graded responses and the answer key from the Google form
chamTheoCLB now also writes RAW_PHIEU.xlsx (every answer of every
submission, one row per question, including discarded submissions; exam
rows carry the key, right/wrong, points, Google's own score and whether
it counts) and DAP_AN.xlsx (100 questions with options and answers).
DINH_DANG_RAW.md documents both formats and how to derive the kiosk
files, as the contract for a processing skill to be written later. A
test keeps the column list in the script and the document in step.

Co-Authored-By: Claude Opus 5.5 <noreply@anthropic.com>
Claude-Session: https://claude.ai/code/session_011YvVpnNpPKoWNFXd1cS6v3
</commit_message>
<xml_diff>
--- a/mau_forms_thi_clb/HUONG_DAN_GOOGLE_FORMS.docx
+++ b/mau_forms_thi_clb/HUONG_DAN_GOOGLE_FORMS.docx
@@ -886,6 +886,70 @@
                 <w:b/>
                 <w:sz w:val="20"/>
               </w:rPr>
+              <w:t>RAW_PHIEU.xlsx</w:t>
+            </w:r>
+          </w:p>
+        </w:tc>
+        <w:tc>
+          <w:tcPr>
+            <w:tcW w:type="dxa" w:w="4320"/>
+          </w:tcPr>
+          <w:p>
+            <w:r/>
+            <w:r>
+              <w:rPr>
+                <w:b w:val="0"/>
+                <w:sz w:val="20"/>
+              </w:rPr>
+              <w:t>Dữ liệu raw: mọi câu trả lời của mọi phiếu, mỗi câu một dòng. Câu đề thi đã chấm sẵn: đúng hay sai, điểm, có được tính không. Dùng để soát lại hoặc xử lí tiếp. Định dạng xem tệp DINH_DANG_RAW.md.</w:t>
+            </w:r>
+          </w:p>
+        </w:tc>
+      </w:tr>
+      <w:tr>
+        <w:tc>
+          <w:tcPr>
+            <w:tcW w:type="dxa" w:w="4320"/>
+          </w:tcPr>
+          <w:p>
+            <w:r/>
+            <w:r>
+              <w:rPr>
+                <w:b/>
+                <w:sz w:val="20"/>
+              </w:rPr>
+              <w:t>DAP_AN.xlsx</w:t>
+            </w:r>
+          </w:p>
+        </w:tc>
+        <w:tc>
+          <w:tcPr>
+            <w:tcW w:type="dxa" w:w="4320"/>
+          </w:tcPr>
+          <w:p>
+            <w:r/>
+            <w:r>
+              <w:rPr>
+                <w:b w:val="0"/>
+                <w:sz w:val="20"/>
+              </w:rPr>
+              <w:t>Đáp án của 100 câu đề thi, kèm 4 lựa chọn và điểm mỗi câu.</w:t>
+            </w:r>
+          </w:p>
+        </w:tc>
+      </w:tr>
+      <w:tr>
+        <w:tc>
+          <w:tcPr>
+            <w:tcW w:type="dxa" w:w="4320"/>
+          </w:tcPr>
+          <w:p>
+            <w:r/>
+            <w:r>
+              <w:rPr>
+                <w:b/>
+                <w:sz w:val="20"/>
+              </w:rPr>
               <w:t>BANG_DIEM &lt;ngày giờ&gt;</w:t>
             </w:r>
           </w:p>

</xml_diff>

<commit_message>
Show only the chosen clubs' exams and rank with a Top 1-10 grid
The ranking grid is now rows Top 1..Top 10 with the clubs as columns,
one club per column, not required: students rank as many as they like.
After ticking up to 5 clubs, students pick 'which club first?', take
that club's exam, then pick 'which club next?' from the clubs after it
in the list, so only the chosen clubs' exams appear. Google Forms cannot
branch on checkboxes, so the tick stays as the hard cap and grading
counts only exams that were ticked and ranked; gaps in the Top list are
closed up and reported.

Raw format, the xu-li-raw-forms skill (now reports Top gaps), its tests
and the guide are updated to match. Checked with a mock FormApp: a
student choosing two clubs sees exactly those two exams; the skill's
output imports into the kiosk with no warnings.

Co-Authored-By: Claude Opus 5.5 <noreply@anthropic.com>
Claude-Session: https://claude.ai/code/session_011YvVpnNpPKoWNFXd1cS6v3
</commit_message>
<xml_diff>
--- a/mau_forms_thi_clb/HUONG_DAN_GOOGLE_FORMS.docx
+++ b/mau_forms_thi_clb/HUONG_DAN_GOOGLE_FORMS.docx
@@ -602,7 +602,7 @@
         <w:t>Làm thử.</w:t>
       </w:r>
       <w:r>
-        <w:t xml:space="preserve"> Bấm biểu tượng con mắt (Xem trước) và làm thử: chọn Không ở một buổi, thi một CLB, rồi chọn “Em không thi thêm CLB nào buổi này”. Kiểm tra biểu mẫu nhảy đúng.</w:t>
+        <w:t xml:space="preserve"> Bấm biểu tượng con mắt (Xem trước) và làm thử: chọn Không ở một buổi; ở buổi khác xếp vài CLB ở bảng Top, tick 2 CLB, chọn làm CLB thứ nhất, rồi CLB thứ hai, rồi “Em không thi thêm CLB nào buổi này”. Kiểm tra chỉ đề của 2 CLB đó hiện ra.</w:t>
       </w:r>
     </w:p>
     <w:p>
@@ -626,7 +626,7 @@
         <w:pStyle w:val="ListBullet"/>
       </w:pPr>
       <w:r>
-        <w:t>Nhắc học sinh: buổi nào bận thì chọn “Không, em bận buổi này”; xếp hạng thì mỗi hạng chỉ chọn cho một CLB; tick trước các CLB muốn thi, tối đa 5 CLB mỗi buổi. Chỉ bài thi của CLB đã tick mới được tính điểm.</w:t>
+        <w:t>Nhắc học sinh: buổi nào bận thì chọn “Không, em bận buổi này”. Ở bảng Top, chọn CLB thích nhất ở Top 1, xếp bao nhiêu CLB cũng được, mỗi CLB chỉ chọn một lần. Tick trước các CLB muốn thi, tối đa 5. Sau đó chọn lần lượt CLB để làm bài, theo thứ tự trong danh sách; chỉ đề của CLB được chọn mới hiện ra. Chỉ bài của CLB đã tick và đã xếp ở bảng Top mới được tính điểm.</w:t>
       </w:r>
     </w:p>
     <w:p>
@@ -1061,7 +1061,7 @@
         <w:t xml:space="preserve">4. </w:t>
       </w:r>
       <w:r>
-        <w:t>Đối chiếu với trang “Cảnh báo” trong BANG_DIEM.xlsx. Hai cảnh báo hay gặp: em làm bài một CLB mà không tick CLB đó (bài không được tính), và em tick một CLB mà không làm bài.</w:t>
+        <w:t>Đối chiếu với trang “Cảnh báo” trong BANG_DIEM.xlsx. Hai cảnh báo hay gặp: em làm bài một CLB mà không tick hoặc không xếp ở bảng Top (bài không được tính), và em tick một CLB mà không làm bài.</w:t>
       </w:r>
     </w:p>
     <w:p>

</xml_diff>

<commit_message>
Rank clubs with one dropdown per Top, including a (Bỏ trống) option
Each day's ranking is now Top 1..Top N dropdowns ([<day>-top-k]), each
listing '(Bỏ trống)' then the day's clubs, none required. Dropdowns
cannot stop the same club being picked twice, so grading keeps the
higher Top and warns; gaps are closed up as before. Forms made with the
earlier grid layouts still grade the same way.

The tao-google-form-clb skill emits this layout directly (question
count 167 -> 212 for the sample) and its guide describes the dropdowns.
The xu-li-raw-forms skill now keeps the best Top for a repeated club
instead of letting soat() reject the whole set for duplicate
preferences, and reports it. Raw format doc, Word guide and tests
updated; a Node mock grades a dropdown response and an old-grid
response through the repo's .gs.

Co-Authored-By: Claude Opus 5.5 <noreply@anthropic.com>
Claude-Session: https://claude.ai/code/session_011YvVpnNpPKoWNFXd1cS6v3
</commit_message>
<xml_diff>
--- a/mau_forms_thi_clb/HUONG_DAN_GOOGLE_FORMS.docx
+++ b/mau_forms_thi_clb/HUONG_DAN_GOOGLE_FORMS.docx
@@ -602,7 +602,7 @@
         <w:t>Làm thử.</w:t>
       </w:r>
       <w:r>
-        <w:t xml:space="preserve"> Bấm biểu tượng con mắt (Xem trước) và làm thử: chọn Không ở một buổi; ở buổi khác xếp vài CLB ở bảng Top, tick 2 CLB, chọn làm CLB thứ nhất, rồi CLB thứ hai, rồi “Em không thi thêm CLB nào buổi này”. Kiểm tra chỉ đề của 2 CLB đó hiện ra.</w:t>
+        <w:t xml:space="preserve"> Bấm biểu tượng con mắt (Xem trước) và làm thử: chọn Không ở một buổi; ở buổi khác chọn vài CLB ở Top 1, Top 2 (Top còn lại để “(Bỏ trống)”), tick 2 CLB, chọn làm CLB thứ nhất, rồi CLB thứ hai, rồi “Em không thi thêm CLB nào buổi này”. Kiểm tra chỉ đề của 2 CLB đó hiện ra.</w:t>
       </w:r>
     </w:p>
     <w:p>
@@ -626,7 +626,7 @@
         <w:pStyle w:val="ListBullet"/>
       </w:pPr>
       <w:r>
-        <w:t>Nhắc học sinh: buổi nào bận thì chọn “Không, em bận buổi này”. Ở bảng Top, chọn CLB thích nhất ở Top 1, xếp bao nhiêu CLB cũng được, mỗi CLB chỉ chọn một lần. Tick trước các CLB muốn thi, tối đa 5. Sau đó chọn lần lượt CLB để làm bài, theo thứ tự trong danh sách; chỉ đề của CLB được chọn mới hiện ra. Chỉ bài của CLB đã tick và đã xếp ở bảng Top mới được tính điểm.</w:t>
+        <w:t>Nhắc học sinh: buổi nào bận thì chọn “Không, em bận buổi này”. Bấm vào Top 1 và chọn CLB thích nhất trong danh sách, rồi Top 2...; Top không dùng thì để “(Bỏ trống)”; mỗi CLB chỉ chọn một lần. Tick trước các CLB muốn thi, tối đa 5. Sau đó chọn lần lượt CLB để làm bài, theo thứ tự trong danh sách; chỉ đề của CLB được chọn mới hiện ra. Chỉ bài của CLB đã tick và đã chọn ở một Top mới được tính điểm.</w:t>
       </w:r>
     </w:p>
     <w:p>
@@ -1061,7 +1061,7 @@
         <w:t xml:space="preserve">4. </w:t>
       </w:r>
       <w:r>
-        <w:t>Đối chiếu với trang “Cảnh báo” trong BANG_DIEM.xlsx. Hai cảnh báo hay gặp: em làm bài một CLB mà không tick hoặc không xếp ở bảng Top (bài không được tính), và em tick một CLB mà không làm bài.</w:t>
+        <w:t>Đối chiếu với trang “Cảnh báo” trong BANG_DIEM.xlsx. Hai cảnh báo hay gặp: em làm bài một CLB mà không tick hoặc không chọn ở Top nào (bài không được tính), và em tick một CLB mà không làm bài.</w:t>
       </w:r>
     </w:p>
     <w:p>

</xml_diff>

<commit_message>
Rewrite the guides around the single workbook; add example workbooks
New one-page operator guide mau_csv/HUONG_DAN_SO_NHAP.md. The user
guide, README, handover notes, data document, Forms guides (and their
generated .docx/.md) now describe one Sổ nhập CLB instead of three
files; HUONG_DAN_CSV.md is reframed as the internal-format reference.
Workbook versions of the guide example, the clean set and the
competition demo set are generated by mau_csv/tao_so_nhap.py, plus a
workbook with five deliberate errors to show the error list. The
template keeps the student ID column as text.

Co-Authored-By: Claude Opus 5.5 <noreply@anthropic.com>
Claude-Session: https://claude.ai/code/session_015ppj7i9oAjb5owTn8mDi1Y
</commit_message>
<xml_diff>
--- a/mau_forms_thi_clb/HUONG_DAN_GOOGLE_FORMS.docx
+++ b/mau_forms_thi_clb/HUONG_DAN_GOOGLE_FORMS.docx
@@ -773,7 +773,7 @@
                 <w:b w:val="0"/>
                 <w:sz w:val="20"/>
               </w:rPr>
-              <w:t>Xem kết quả. Có 4 trang: Bảng điểm (điểm từng CLB, thang 10), 02, 03 và Cảnh báo.</w:t>
+              <w:t>Xem kết quả. Có 2 trang: Bảng điểm (điểm từng CLB, thang 10) và Cảnh báo.</w:t>
             </w:r>
           </w:p>
         </w:tc>
@@ -790,7 +790,7 @@
                 <w:b/>
                 <w:sz w:val="20"/>
               </w:rPr>
-              <w:t>01_danh_sach_CLB.xlsx</w:t>
+              <w:t>SO_NHAP_CLB.xlsx</w:t>
             </w:r>
           </w:p>
         </w:tc>
@@ -805,71 +805,7 @@
                 <w:b w:val="0"/>
                 <w:sz w:val="20"/>
               </w:rPr>
-              <w:t>Nạp phần mềm. Phải điền cột capacity (chỉ tiêu) trước.</w:t>
-            </w:r>
-          </w:p>
-        </w:tc>
-      </w:tr>
-      <w:tr>
-        <w:tc>
-          <w:tcPr>
-            <w:tcW w:type="dxa" w:w="4320"/>
-          </w:tcPr>
-          <w:p>
-            <w:r/>
-            <w:r>
-              <w:rPr>
-                <w:b/>
-                <w:sz w:val="20"/>
-              </w:rPr>
-              <w:t>02_chon_CLB_muon_thi.xlsx</w:t>
-            </w:r>
-          </w:p>
-        </w:tc>
-        <w:tc>
-          <w:tcPr>
-            <w:tcW w:type="dxa" w:w="4320"/>
-          </w:tcPr>
-          <w:p>
-            <w:r/>
-            <w:r>
-              <w:rPr>
-                <w:b w:val="0"/>
-                <w:sz w:val="20"/>
-              </w:rPr>
-              <w:t>Nạp phần mềm. CLB em dự thi và điểm.</w:t>
-            </w:r>
-          </w:p>
-        </w:tc>
-      </w:tr>
-      <w:tr>
-        <w:tc>
-          <w:tcPr>
-            <w:tcW w:type="dxa" w:w="4320"/>
-          </w:tcPr>
-          <w:p>
-            <w:r/>
-            <w:r>
-              <w:rPr>
-                <w:b/>
-                <w:sz w:val="20"/>
-              </w:rPr>
-              <w:t>03_xep_hang_nguyen_vong.xlsx</w:t>
-            </w:r>
-          </w:p>
-        </w:tc>
-        <w:tc>
-          <w:tcPr>
-            <w:tcW w:type="dxa" w:w="4320"/>
-          </w:tcPr>
-          <w:p>
-            <w:r/>
-            <w:r>
-              <w:rPr>
-                <w:b w:val="0"/>
-                <w:sz w:val="20"/>
-              </w:rPr>
-              <w:t>Nạp phần mềm. Thứ tự nguyện vọng từng buổi.</w:t>
+              <w:t>Sổ nhập CLB: tệp DUY NHẤT nạp vào phần mềm. Trang “1. CLB” phải điền cột Chỉ tiêu trước. Trang “2. Học sinh”: nguyện vọng và điểm.</w:t>
             </w:r>
           </w:p>
         </w:tc>
@@ -1019,7 +955,7 @@
         <w:t xml:space="preserve">1. </w:t>
       </w:r>
       <w:r>
-        <w:t>Mở 01_danh_sach_CLB.xlsx bằng Excel. Điền cột capacity: số học sinh tối đa của từng CLB (lớn hơn 0). Nếu có suất dành cho nhóm ưu tiên thì điền reserve_capacity và reserve_group. Lưu lại.</w:t>
+        <w:t>Mở SO_NHAP_CLB.xlsx bằng Excel, trang “1. CLB”. Điền cột Chỉ tiêu: số học sinh tối đa của từng CLB (lớn hơn 0). Nếu có suất dành cho nhóm ưu tiên thì điền Suất ưu tiên và Nhóm ưu tiên. Lưu lại.</w:t>
       </w:r>
     </w:p>
     <w:p>
@@ -1033,7 +969,7 @@
         <w:t xml:space="preserve">2. </w:t>
       </w:r>
       <w:r>
-        <w:t>Nạp theo đúng thứ tự: 01, rồi 02, rồi 03.</w:t>
+        <w:t>Trong phần mềm, thẻ “01 · Vận hành sắp xếp”: kéo sổ vào ô nạp, xem dòng tóm tắt, bấm “Nhập sổ”.</w:t>
       </w:r>
     </w:p>
     <w:p>
@@ -1047,7 +983,7 @@
         <w:t xml:space="preserve">3. </w:t>
       </w:r>
       <w:r>
-        <w:t>Sau mỗi lần nạp, đọc hết phần cảnh báo của phần mềm. Nạp được không có nghĩa là không có gì sai.</w:t>
+        <w:t>Sau khi nạp, đọc hết phần cảnh báo của phần mềm. Nạp được không có nghĩa là không có gì sai.</w:t>
       </w:r>
     </w:p>
     <w:p>
@@ -1272,7 +1208,7 @@
                 <w:b w:val="0"/>
                 <w:sz w:val="20"/>
               </w:rPr>
-              <w:t>Chưa điền cột capacity trong 01_danh_sach_CLB.xlsx.</w:t>
+              <w:t>Chưa điền cột Chỉ tiêu ở trang “1. CLB” của SO_NHAP_CLB.xlsx.</w:t>
             </w:r>
           </w:p>
         </w:tc>

</xml_diff>